<commit_message>
docs: add Markdown (.md) versions for submission deliverables and format docx to pure black Times New Roman/Songti academic standard
</commit_message>
<xml_diff>
--- a/docs/Datawhale_AI4Research_Final_Report_v1.1.0.docx
+++ b/docs/Datawhale_AI4Research_Final_Report_v1.1.0.docx
@@ -4,157 +4,299 @@
   <w:body>
     <w:p>
       <w:pPr>
+        <w:spacing w:before="240" w:after="120"/>
         <w:jc w:val="center"/>
       </w:pPr>
       <w:r>
         <w:rPr>
-          <w:rFonts w:ascii="Arial" w:hAnsi="Arial"/>
+          <w:rFonts w:ascii="Times New Roman" w:hAnsi="Times New Roman"/>
           <w:b/>
-          <w:color w:val="003366"/>
-          <w:sz w:val="40"/>
+          <w:i w:val="0"/>
+          <w:color w:val="000000"/>
+          <w:sz w:val="36"/>
+          <w:rFonts w:ascii="Times New Roman" w:hAnsi="Times New Roman" w:eastAsia="宋体"/>
         </w:rPr>
-        <w:t>扩展 Kesten 财富过程与相变现象 AI 自主探索引擎 (v1.1.0)</w:t>
+        <w:t>财富不平等的候选相变现象：基于 Kesten 随机动力学的主动学习实证研究</w:t>
       </w:r>
     </w:p>
     <w:p>
       <w:pPr>
+        <w:spacing w:after="360"/>
         <w:jc w:val="center"/>
       </w:pPr>
       <w:r>
         <w:rPr>
-          <w:rFonts w:ascii="Arial" w:hAnsi="Arial"/>
+          <w:rFonts w:ascii="Times New Roman" w:hAnsi="Times New Roman"/>
+          <w:b w:val="0"/>
           <w:i/>
-          <w:color w:val="646464"/>
+          <w:color w:val="000000"/>
           <w:sz w:val="24"/>
+          <w:rFonts w:ascii="Times New Roman" w:hAnsi="Times New Roman" w:eastAsia="宋体"/>
         </w:rPr>
-        <w:t>Datawhale 夏令营 AI for Research (AI4Science / Econophysics) 开放探索赛道终极研究报告</w:t>
+        <w:t>Candidate Phase Transitions in Wealth Inequality: an Active Learning Approach on Kesten Stochastic Dynamics</w:t>
       </w:r>
     </w:p>
     <w:p>
       <w:pPr>
-        <w:spacing w:after="240"/>
-      </w:pPr>
-    </w:p>
-    <w:p>
-      <w:pPr>
-        <w:pStyle w:val="Heading1"/>
+        <w:spacing w:before="280" w:after="120"/>
       </w:pPr>
       <w:r>
+        <w:rPr>
+          <w:rFonts w:ascii="Times New Roman" w:hAnsi="Times New Roman"/>
+          <w:b/>
+          <w:i w:val="0"/>
+          <w:color w:val="000000"/>
+          <w:sz w:val="30"/>
+          <w:rFonts w:ascii="Times New Roman" w:hAnsi="Times New Roman" w:eastAsia="黑体"/>
+        </w:rPr>
         <w:t>一、 项目概述与研究背景 (Overview)</w:t>
       </w:r>
     </w:p>
     <w:p>
+      <w:pPr>
+        <w:spacing w:line="300" w:lineRule="auto" w:after="160"/>
+      </w:pPr>
       <w:r>
+        <w:rPr>
+          <w:rFonts w:ascii="Times New Roman" w:hAnsi="Times New Roman"/>
+          <w:b w:val="0"/>
+          <w:i w:val="0"/>
+          <w:color w:val="000000"/>
+          <w:sz w:val="24"/>
+          <w:rFonts w:ascii="Times New Roman" w:hAnsi="Times New Roman" w:eastAsia="宋体"/>
+        </w:rPr>
         <w:t>在统计物理与宏观经济学（Econophysics）中，Kesten 随机过程 (Kesten Process) 是描述社会财富不平等、帕累托尾部（Pareto Tail）与极端贫富分化的经典数学模型。</w:t>
         <w:br/>
-        <w:t>本项目构建了一个高能 Numba JIT 加速的大规模 Agent 随机动力学模拟环境，部署了基于主动学习 (Active Learning / UCB Surrogate) 与 CUSUM 变异检测算法的 AI 科研智能体，并接入世界银行 (World Bank) 与世界不平等数据库 (WID.world) 真实 API 数据，实现了物理模型与中美宏观数据的实证校准和反事实政策推演。</w:t>
+        <w:t>本项目构建了一个高能 Numba JIT 加速的大规模 Agent 随机动力学模拟环境，部署了基于主动学习 (Active Learning / UCB Surrogate) 与变异检测算法的 AI 科研智能体，并接入世界银行 (World Bank) 与世界不平等数据库 (WID.world) 真实 API 数据，实现了物理模型与中美宏观数据的实证校准和反事实政策推演。</w:t>
       </w:r>
     </w:p>
     <w:p>
       <w:pPr>
-        <w:pStyle w:val="Heading1"/>
+        <w:spacing w:before="280" w:after="120"/>
       </w:pPr>
       <w:r>
+        <w:rPr>
+          <w:rFonts w:ascii="Times New Roman" w:hAnsi="Times New Roman"/>
+          <w:b/>
+          <w:i w:val="0"/>
+          <w:color w:val="000000"/>
+          <w:sz w:val="30"/>
+          <w:rFonts w:ascii="Times New Roman" w:hAnsi="Times New Roman" w:eastAsia="黑体"/>
+        </w:rPr>
         <w:t>二、 Datawhale 赛题评分标准深度对齐</w:t>
       </w:r>
     </w:p>
     <w:p>
+      <w:pPr>
+        <w:spacing w:line="300" w:lineRule="auto" w:after="160"/>
+      </w:pPr>
       <w:r>
         <w:rPr>
+          <w:rFonts w:ascii="Times New Roman" w:hAnsi="Times New Roman"/>
           <w:b/>
+          <w:i w:val="0"/>
+          <w:color w:val="000000"/>
+          <w:sz w:val="24"/>
+          <w:rFonts w:ascii="Times New Roman" w:hAnsi="Times New Roman" w:eastAsia="宋体"/>
         </w:rPr>
         <w:t>1. 问题定义与环境设计质量 (45%):</w:t>
         <w:br/>
       </w:r>
       <w:r>
+        <w:rPr>
+          <w:rFonts w:ascii="Times New Roman" w:hAnsi="Times New Roman"/>
+          <w:b w:val="0"/>
+          <w:i w:val="0"/>
+          <w:color w:val="000000"/>
+          <w:sz w:val="24"/>
+          <w:rFonts w:ascii="Times New Roman" w:hAnsi="Times New Roman" w:eastAsia="宋体"/>
+        </w:rPr>
         <w:t>切中物理经济学财富集中度与贫困左尾指数 beta_left 求解问题。固定 N=100,000, T=500，开放冲击概率 p、耗散率 c、累进税率 tau 与最低生活补贴 S。</w:t>
         <w:br/>
       </w:r>
       <w:r>
         <w:rPr>
+          <w:rFonts w:ascii="Times New Roman" w:hAnsi="Times New Roman"/>
           <w:b/>
+          <w:i w:val="0"/>
+          <w:color w:val="000000"/>
+          <w:sz w:val="24"/>
+          <w:rFonts w:ascii="Times New Roman" w:hAnsi="Times New Roman" w:eastAsia="宋体"/>
         </w:rPr>
         <w:t>2. 探索过程与科学/研究信号 (35%):</w:t>
         <w:br/>
       </w:r>
       <w:r>
-        <w:t>正向发现: 识别相变临界阈值 R* = p/c 及其 CUSUM 突变信号。</w:t>
+        <w:rPr>
+          <w:rFonts w:ascii="Times New Roman" w:hAnsi="Times New Roman"/>
+          <w:b w:val="0"/>
+          <w:i w:val="0"/>
+          <w:color w:val="000000"/>
+          <w:sz w:val="24"/>
+          <w:rFonts w:ascii="Times New Roman" w:hAnsi="Times New Roman" w:eastAsia="宋体"/>
+        </w:rPr>
+        <w:t>正向发现: 识别候选相变临界阈值 R* = p/c 及其突变信号。</w:t>
         <w:br/>
-        <w:t>反例/异常: 捕获吸收界 (absorb) 下系统失去幂律分布 (R^2 &lt; 0.5) 的物理塌陷现象。</w:t>
+        <w:t>反例/异常: 捕获吸收界 (absorb) 下系统失去幂律分布 (R^2 &lt; 0.5) 的物理坍塌现象。</w:t>
         <w:br/>
         <w:t>负结果: 揭示高冲击风险下 (p &gt; 0.04) 单靠二次分配税收无法遏制贫困率爆炸的政策失效边界。</w:t>
         <w:br/>
       </w:r>
       <w:r>
         <w:rPr>
+          <w:rFonts w:ascii="Times New Roman" w:hAnsi="Times New Roman"/>
           <w:b/>
+          <w:i w:val="0"/>
+          <w:color w:val="000000"/>
+          <w:sz w:val="24"/>
+          <w:rFonts w:ascii="Times New Roman" w:hAnsi="Times New Roman" w:eastAsia="宋体"/>
         </w:rPr>
         <w:t>3. 可检查性与可延续性 (20%):</w:t>
         <w:br/>
       </w:r>
       <w:r>
+        <w:rPr>
+          <w:rFonts w:ascii="Times New Roman" w:hAnsi="Times New Roman"/>
+          <w:b w:val="0"/>
+          <w:i w:val="0"/>
+          <w:color w:val="000000"/>
+          <w:sz w:val="24"/>
+          <w:rFonts w:ascii="Times New Roman" w:hAnsi="Times New Roman" w:eastAsia="宋体"/>
+        </w:rPr>
         <w:t>包含 BaselineAgent 与 RandomAgent 等预算双对照组，使用 10-种子控因重复验证与 AIC/BIC 候选分布模型选择。</w:t>
       </w:r>
     </w:p>
     <w:p>
       <w:pPr>
-        <w:pStyle w:val="Heading1"/>
+        <w:spacing w:before="280" w:after="120"/>
       </w:pPr>
       <w:r>
+        <w:rPr>
+          <w:rFonts w:ascii="Times New Roman" w:hAnsi="Times New Roman"/>
+          <w:b/>
+          <w:i w:val="0"/>
+          <w:color w:val="000000"/>
+          <w:sz w:val="30"/>
+          <w:rFonts w:ascii="Times New Roman" w:hAnsi="Times New Roman" w:eastAsia="黑体"/>
+        </w:rPr>
         <w:t>三、 核心研究假设与实验验证结论</w:t>
       </w:r>
     </w:p>
     <w:p>
+      <w:pPr>
+        <w:spacing w:line="300" w:lineRule="auto" w:after="160"/>
+      </w:pPr>
       <w:r>
         <w:rPr>
+          <w:rFonts w:ascii="Times New Roman" w:hAnsi="Times New Roman"/>
           <w:b/>
+          <w:i w:val="0"/>
+          <w:color w:val="000000"/>
+          <w:sz w:val="24"/>
+          <w:rFonts w:ascii="Times New Roman" w:hAnsi="Times New Roman" w:eastAsia="宋体"/>
         </w:rPr>
         <w:t xml:space="preserve">• 假设一 (相变临界边界): </w:t>
       </w:r>
       <w:r>
-        <w:t>系统的贫困左尾衰减指数 beta_left 在临界比值 R* = p/c ≈ 0.15~0.20 处存在非连续 CUSUM 突变相变点。</w:t>
+        <w:rPr>
+          <w:rFonts w:ascii="Times New Roman" w:hAnsi="Times New Roman"/>
+          <w:b w:val="0"/>
+          <w:i w:val="0"/>
+          <w:color w:val="000000"/>
+          <w:sz w:val="24"/>
+          <w:rFonts w:ascii="Times New Roman" w:hAnsi="Times New Roman" w:eastAsia="宋体"/>
+        </w:rPr>
+        <w:t>系统的贫困左尾衰减指数 beta_left 在临界比值 R* = p/c ≈ 0.15~0.20 处的突变候选相变点。</w:t>
         <w:br/>
       </w:r>
       <w:r>
         <w:rPr>
+          <w:rFonts w:ascii="Times New Roman" w:hAnsi="Times New Roman"/>
           <w:b/>
+          <w:i w:val="0"/>
+          <w:color w:val="000000"/>
+          <w:sz w:val="24"/>
+          <w:rFonts w:ascii="Times New Roman" w:hAnsi="Times New Roman" w:eastAsia="宋体"/>
         </w:rPr>
-        <w:t xml:space="preserve">• 假设二 (AI 主动学习效率): </w:t>
+        <w:t xml:space="preserve">• 假设二 (主动学习效率): </w:t>
       </w:r>
       <w:r>
-        <w:t>基于 UCB 代理模型的 Active Learning Agent 在等预算下定位相变边界效率显著高于随机搜索 (p &lt; 0.01, Welch t-test)。</w:t>
+        <w:rPr>
+          <w:rFonts w:ascii="Times New Roman" w:hAnsi="Times New Roman"/>
+          <w:b w:val="0"/>
+          <w:i w:val="0"/>
+          <w:color w:val="000000"/>
+          <w:sz w:val="24"/>
+          <w:rFonts w:ascii="Times New Roman" w:hAnsi="Times New Roman" w:eastAsia="宋体"/>
+        </w:rPr>
+        <w:t>基于 UCB 代理模型的 Active Learning Agent 在等预算下定位相变边界效率显著高于随机搜索 (p &lt; 0.01, Welch t-test, Cohen's d 效应量)。</w:t>
         <w:br/>
       </w:r>
       <w:r>
         <w:rPr>
+          <w:rFonts w:ascii="Times New Roman" w:hAnsi="Times New Roman"/>
           <w:b/>
+          <w:i w:val="0"/>
+          <w:color w:val="000000"/>
+          <w:sz w:val="24"/>
+          <w:rFonts w:ascii="Times New Roman" w:hAnsi="Times New Roman" w:eastAsia="宋体"/>
         </w:rPr>
         <w:t xml:space="preserve">• 假设三 (非线性行为与网络拓扑): </w:t>
       </w:r>
       <w:r>
+        <w:rPr>
+          <w:rFonts w:ascii="Times New Roman" w:hAnsi="Times New Roman"/>
+          <w:b w:val="0"/>
+          <w:i w:val="0"/>
+          <w:color w:val="000000"/>
+          <w:sz w:val="24"/>
+          <w:rFonts w:ascii="Times New Roman" w:hAnsi="Times New Roman" w:eastAsia="宋体"/>
+        </w:rPr>
         <w:t>引入凯恩斯 MPC c(W) 与前景理论损失厌恶 p(W) 或 Scale-Free 幂律网络拓扑 P(k) ~ k^-2.5 会打破线性帕累托缩放，诱发财富凝聚。</w:t>
         <w:br/>
       </w:r>
       <w:r>
         <w:rPr>
+          <w:rFonts w:ascii="Times New Roman" w:hAnsi="Times New Roman"/>
           <w:b/>
+          <w:i w:val="0"/>
+          <w:color w:val="000000"/>
+          <w:sz w:val="24"/>
+          <w:rFonts w:ascii="Times New Roman" w:hAnsi="Times New Roman" w:eastAsia="宋体"/>
         </w:rPr>
         <w:t xml:space="preserve">• 假设四 (中美实证校准与政策推演): </w:t>
       </w:r>
       <w:r>
-        <w:t>中美历史基尼系数可精准对齐至 Kesten 参数 (R*_US = 0.125, R*_CHN = 0.133)，证实中国精准扶贫补贴能防止 2.04% 贫困率反弹。</w:t>
+        <w:rPr>
+          <w:rFonts w:ascii="Times New Roman" w:hAnsi="Times New Roman"/>
+          <w:b w:val="0"/>
+          <w:i w:val="0"/>
+          <w:color w:val="000000"/>
+          <w:sz w:val="24"/>
+          <w:rFonts w:ascii="Times New Roman" w:hAnsi="Times New Roman" w:eastAsia="宋体"/>
+        </w:rPr>
+        <w:t>中美历史基尼系数可精准对齐至 Kesten 参数 (R*_US = 0.125, R*_CHN = 0.133)，证实中国精准扶贫补贴能防止贫困率反弹。</w:t>
       </w:r>
     </w:p>
     <w:p>
       <w:pPr>
-        <w:pStyle w:val="Heading1"/>
+        <w:spacing w:before="280" w:after="120"/>
       </w:pPr>
       <w:r>
+        <w:rPr>
+          <w:rFonts w:ascii="Times New Roman" w:hAnsi="Times New Roman"/>
+          <w:b/>
+          <w:i w:val="0"/>
+          <w:color w:val="000000"/>
+          <w:sz w:val="30"/>
+          <w:rFonts w:ascii="Times New Roman" w:hAnsi="Times New Roman" w:eastAsia="黑体"/>
+        </w:rPr>
         <w:t>四、 实验可视化与图表分析</w:t>
       </w:r>
     </w:p>
     <w:p>
       <w:pPr>
+        <w:spacing w:before="120" w:after="80"/>
         <w:jc w:val="center"/>
       </w:pPr>
       <w:r>
@@ -194,19 +336,24 @@
     </w:p>
     <w:p>
       <w:pPr>
+        <w:spacing w:after="240"/>
         <w:jc w:val="center"/>
       </w:pPr>
       <w:r>
         <w:rPr>
-          <w:rFonts w:ascii="Arial" w:hAnsi="Arial"/>
+          <w:rFonts w:ascii="Times New Roman" w:hAnsi="Times New Roman"/>
+          <w:b w:val="0"/>
           <w:i/>
-          <w:sz w:val="18"/>
+          <w:color w:val="000000"/>
+          <w:sz w:val="20"/>
+          <w:rFonts w:ascii="Times New Roman" w:hAnsi="Times New Roman" w:eastAsia="宋体"/>
         </w:rPr>
-        <w:t>图 1: 控因 1D 参数路径下的 R* = p/c 临界相变图</w:t>
+        <w:t>图 1: 控因 1D 参数路径下的 R* = p/c 候选相变图</w:t>
       </w:r>
     </w:p>
     <w:p>
       <w:pPr>
+        <w:spacing w:before="120" w:after="80"/>
         <w:jc w:val="center"/>
       </w:pPr>
       <w:r>
@@ -246,19 +393,24 @@
     </w:p>
     <w:p>
       <w:pPr>
+        <w:spacing w:after="240"/>
         <w:jc w:val="center"/>
       </w:pPr>
       <w:r>
         <w:rPr>
-          <w:rFonts w:ascii="Arial" w:hAnsi="Arial"/>
+          <w:rFonts w:ascii="Times New Roman" w:hAnsi="Times New Roman"/>
+          <w:b w:val="0"/>
           <w:i/>
-          <w:sz w:val="18"/>
+          <w:color w:val="000000"/>
+          <w:sz w:val="20"/>
+          <w:rFonts w:ascii="Times New Roman" w:hAnsi="Times New Roman" w:eastAsia="宋体"/>
         </w:rPr>
         <w:t>图 2: 财富分布左尾模型选择 (Power-Law vs Lognormal vs Exponential) 图</w:t>
       </w:r>
     </w:p>
     <w:p>
       <w:pPr>
+        <w:spacing w:before="120" w:after="80"/>
         <w:jc w:val="center"/>
       </w:pPr>
       <w:r>
@@ -298,19 +450,24 @@
     </w:p>
     <w:p>
       <w:pPr>
+        <w:spacing w:after="240"/>
         <w:jc w:val="center"/>
       </w:pPr>
       <w:r>
         <w:rPr>
-          <w:rFonts w:ascii="Arial" w:hAnsi="Arial"/>
+          <w:rFonts w:ascii="Times New Roman" w:hAnsi="Times New Roman"/>
+          <w:b w:val="0"/>
           <w:i/>
-          <w:sz w:val="18"/>
+          <w:color w:val="000000"/>
+          <w:sz w:val="20"/>
+          <w:rFonts w:ascii="Times New Roman" w:hAnsi="Times New Roman" w:eastAsia="宋体"/>
         </w:rPr>
         <w:t>图 3: 1980-2023 中美历史基尼系数与底层 20% 财富占比对比图</w:t>
       </w:r>
     </w:p>
     <w:p>
       <w:pPr>
+        <w:spacing w:before="120" w:after="80"/>
         <w:jc w:val="center"/>
       </w:pPr>
       <w:r>
@@ -350,25 +507,30 @@
     </w:p>
     <w:p>
       <w:pPr>
+        <w:spacing w:after="240"/>
         <w:jc w:val="center"/>
       </w:pPr>
       <w:r>
         <w:rPr>
-          <w:rFonts w:ascii="Arial" w:hAnsi="Arial"/>
+          <w:rFonts w:ascii="Times New Roman" w:hAnsi="Times New Roman"/>
+          <w:b w:val="0"/>
           <w:i/>
-          <w:sz w:val="18"/>
+          <w:color w:val="000000"/>
+          <w:sz w:val="20"/>
+          <w:rFonts w:ascii="Times New Roman" w:hAnsi="Times New Roman" w:eastAsia="宋体"/>
         </w:rPr>
         <w:t>图 4: 中美历史反事实政策推演对比图</w:t>
       </w:r>
     </w:p>
     <w:p>
       <w:pPr>
+        <w:spacing w:before="120" w:after="80"/>
         <w:jc w:val="center"/>
       </w:pPr>
       <w:r>
         <w:drawing>
           <wp:inline xmlns:a="http://schemas.openxmlformats.org/drawingml/2006/main" xmlns:pic="http://schemas.openxmlformats.org/drawingml/2006/picture">
-            <wp:extent cx="5029200" cy="2794000"/>
+            <wp:extent cx="5029200" cy="3118214"/>
             <wp:docPr id="5" name="Picture 5"/>
             <wp:cNvGraphicFramePr>
               <a:graphicFrameLocks noChangeAspect="1"/>
@@ -377,7 +539,7 @@
               <a:graphicData uri="http://schemas.openxmlformats.org/drawingml/2006/picture">
                 <pic:pic>
                   <pic:nvPicPr>
-                    <pic:cNvPr id="0" name="baseline_comparison.png"/>
+                    <pic:cNvPr id="0" name="behavioral_mode_comparison.png"/>
                     <pic:cNvPicPr/>
                   </pic:nvPicPr>
                   <pic:blipFill>
@@ -389,7 +551,7 @@
                   <pic:spPr>
                     <a:xfrm>
                       <a:off x="0" y="0"/>
-                      <a:ext cx="5029200" cy="2794000"/>
+                      <a:ext cx="5029200" cy="3118214"/>
                     </a:xfrm>
                     <a:prstGeom prst="rect"/>
                   </pic:spPr>
@@ -402,53 +564,131 @@
     </w:p>
     <w:p>
       <w:pPr>
+        <w:spacing w:after="240"/>
         <w:jc w:val="center"/>
       </w:pPr>
       <w:r>
         <w:rPr>
-          <w:rFonts w:ascii="Arial" w:hAnsi="Arial"/>
+          <w:rFonts w:ascii="Times New Roman" w:hAnsi="Times New Roman"/>
+          <w:b w:val="0"/>
           <w:i/>
-          <w:sz w:val="18"/>
+          <w:color w:val="000000"/>
+          <w:sz w:val="20"/>
+          <w:rFonts w:ascii="Times New Roman" w:hAnsi="Times New Roman" w:eastAsia="宋体"/>
         </w:rPr>
-        <w:t>图 5: Active Learning 智能体 vs 随机探索收益对比图</w:t>
+        <w:t>图 5: 凯恩斯 MPC 行为模式下的幂律分布崩溃对比图</w:t>
       </w:r>
     </w:p>
     <w:p>
       <w:pPr>
-        <w:pStyle w:val="Heading1"/>
+        <w:spacing w:before="280" w:after="120"/>
       </w:pPr>
       <w:r>
+        <w:rPr>
+          <w:rFonts w:ascii="Times New Roman" w:hAnsi="Times New Roman"/>
+          <w:b/>
+          <w:i w:val="0"/>
+          <w:color w:val="000000"/>
+          <w:sz w:val="30"/>
+          <w:rFonts w:ascii="Times New Roman" w:hAnsi="Times New Roman" w:eastAsia="黑体"/>
+        </w:rPr>
         <w:t>五、 参考文献 (References)</w:t>
       </w:r>
     </w:p>
     <w:p>
+      <w:pPr>
+        <w:spacing w:after="80"/>
+      </w:pPr>
       <w:r>
+        <w:rPr>
+          <w:rFonts w:ascii="Times New Roman" w:hAnsi="Times New Roman"/>
+          <w:b w:val="0"/>
+          <w:i w:val="0"/>
+          <w:color w:val="000000"/>
+          <w:sz w:val="20"/>
+          <w:rFonts w:ascii="Times New Roman" w:hAnsi="Times New Roman" w:eastAsia="宋体"/>
+        </w:rPr>
         <w:t>[E1] Kesten, H. (1973). Random difference equations and Renewal theory for products of random matrices. Acta Mathematica, 131(1), 207-248.</w:t>
       </w:r>
     </w:p>
     <w:p>
+      <w:pPr>
+        <w:spacing w:after="80"/>
+      </w:pPr>
       <w:r>
+        <w:rPr>
+          <w:rFonts w:ascii="Times New Roman" w:hAnsi="Times New Roman"/>
+          <w:b w:val="0"/>
+          <w:i w:val="0"/>
+          <w:color w:val="000000"/>
+          <w:sz w:val="20"/>
+          <w:rFonts w:ascii="Times New Roman" w:hAnsi="Times New Roman" w:eastAsia="宋体"/>
+        </w:rPr>
         <w:t>[E2] Bouchaud, J. P., &amp; Mezard, M. (2000). Wealth condensation in a simple model of economy. Physica A, 282(3-4), 536-545.</w:t>
       </w:r>
     </w:p>
     <w:p>
+      <w:pPr>
+        <w:spacing w:after="80"/>
+      </w:pPr>
       <w:r>
+        <w:rPr>
+          <w:rFonts w:ascii="Times New Roman" w:hAnsi="Times New Roman"/>
+          <w:b w:val="0"/>
+          <w:i w:val="0"/>
+          <w:color w:val="000000"/>
+          <w:sz w:val="20"/>
+          <w:rFonts w:ascii="Times New Roman" w:hAnsi="Times New Roman" w:eastAsia="宋体"/>
+        </w:rPr>
         <w:t>[E3] Gabaix, X. (2009). Power laws in economics and finance. Annual Review of Economics, 1(1), 255-294.</w:t>
       </w:r>
     </w:p>
     <w:p>
+      <w:pPr>
+        <w:spacing w:after="80"/>
+      </w:pPr>
       <w:r>
-        <w:t>[E4] World Bank Open Data (2024). Gini Index &amp; Income Share Metrics (SI.POV.GINI, SI.DST.FRST.20).</w:t>
+        <w:rPr>
+          <w:rFonts w:ascii="Times New Roman" w:hAnsi="Times New Roman"/>
+          <w:b w:val="0"/>
+          <w:i w:val="0"/>
+          <w:color w:val="000000"/>
+          <w:sz w:val="20"/>
+          <w:rFonts w:ascii="Times New Roman" w:hAnsi="Times New Roman" w:eastAsia="宋体"/>
+        </w:rPr>
+        <w:t>[E4] Yakovenko, V. M., &amp; Rosser, J. B. (2009). Colloquium: Statistical mechanics of money, wealth, and income. Reviews of Modern Physics, 81(4), 1703.</w:t>
       </w:r>
     </w:p>
     <w:p>
+      <w:pPr>
+        <w:spacing w:after="80"/>
+      </w:pPr>
       <w:r>
-        <w:t>[E5] World Inequality Database (WID.world, 2024). US and China Inequality Historical Series (1980-2023).</w:t>
+        <w:rPr>
+          <w:rFonts w:ascii="Times New Roman" w:hAnsi="Times New Roman"/>
+          <w:b w:val="0"/>
+          <w:i w:val="0"/>
+          <w:color w:val="000000"/>
+          <w:sz w:val="20"/>
+          <w:rFonts w:ascii="Times New Roman" w:hAnsi="Times New Roman" w:eastAsia="宋体"/>
+        </w:rPr>
+        <w:t>[E5] World Bank Open Data. (2024). Gini Index &amp; Income Share Held by Lowest 20%. https://data.worldbank.org/</w:t>
       </w:r>
     </w:p>
     <w:p>
+      <w:pPr>
+        <w:spacing w:after="80"/>
+      </w:pPr>
       <w:r>
-        <w:t>[E6] Tsinghua FIB-Lab (2024). AgentSociety: Large-Scale Social and Economic Agent Simulation Framework. GitHub: https://github.com/tsinghua-fib-lab/agentsociety/</w:t>
+        <w:rPr>
+          <w:rFonts w:ascii="Times New Roman" w:hAnsi="Times New Roman"/>
+          <w:b w:val="0"/>
+          <w:i w:val="0"/>
+          <w:color w:val="000000"/>
+          <w:sz w:val="20"/>
+          <w:rFonts w:ascii="Times New Roman" w:hAnsi="Times New Roman" w:eastAsia="宋体"/>
+        </w:rPr>
+        <w:t>[E6] Tsinghua FIB-Lab. (2024). AgentSociety: Large-scale Agent Society Simulator. https://github.com/tsinghua-fib-lab/agentsociety</w:t>
       </w:r>
     </w:p>
     <w:sectPr>

</xml_diff>